<commit_message>
Add Data Cleaning from Santosh
I added data cleaning text from Santosh. Maybe gonna rewrite some elements so the text is more corresponding to other written text.
</commit_message>
<xml_diff>
--- a/Data Visualisation and Insight Word File.docx
+++ b/Data Visualisation and Insight Word File.docx
@@ -212,33 +212,259 @@
         <w:rPr>
           <w:rFonts w:eastAsia="Calibri" w:cs="Calibri"/>
         </w:rPr>
-        <w:t xml:space="preserve">Santosh Data </w:t>
+        <w:t>The dataset underwent multiple Python data cleaning procedures which prepared it for</w:t>
+      </w:r>
+      <w:r>
+        <w:rPr>
+          <w:rFonts w:eastAsia="Calibri" w:cs="Calibri"/>
+        </w:rPr>
+        <w:t xml:space="preserve"> </w:t>
+      </w:r>
+      <w:r>
+        <w:rPr>
+          <w:rFonts w:eastAsia="Calibri" w:cs="Calibri"/>
+        </w:rPr>
+        <w:t>analytical processing.</w:t>
+      </w:r>
+      <w:r>
+        <w:rPr>
+          <w:rFonts w:eastAsia="Calibri" w:cs="Calibri"/>
+        </w:rPr>
+        <w:t xml:space="preserve"> </w:t>
+      </w:r>
+      <w:r>
+        <w:rPr>
+          <w:rFonts w:eastAsia="Calibri" w:cs="Calibri"/>
+        </w:rPr>
+        <w:t xml:space="preserve">The dataset was loaded into a Pandas </w:t>
+      </w:r>
+      <w:proofErr w:type="spellStart"/>
+      <w:r>
+        <w:rPr>
+          <w:rFonts w:eastAsia="Calibri" w:cs="Calibri"/>
+        </w:rPr>
+        <w:t>DataFrame</w:t>
+      </w:r>
+      <w:proofErr w:type="spellEnd"/>
+      <w:r>
+        <w:rPr>
+          <w:rFonts w:eastAsia="Calibri" w:cs="Calibri"/>
+        </w:rPr>
+        <w:t xml:space="preserve"> using the </w:t>
+      </w:r>
+      <w:proofErr w:type="spellStart"/>
+      <w:r>
+        <w:rPr>
+          <w:rFonts w:eastAsia="Calibri" w:cs="Calibri"/>
+        </w:rPr>
+        <w:t>read_</w:t>
       </w:r>
       <w:proofErr w:type="gramStart"/>
       <w:r>
         <w:rPr>
           <w:rFonts w:eastAsia="Calibri" w:cs="Calibri"/>
         </w:rPr>
-        <w:t>Cleaning(</w:t>
-      </w:r>
-      <w:r>
-        <w:rPr>
-          <w:rFonts w:eastAsia="Calibri" w:cs="Calibri"/>
-        </w:rPr>
-        <w:t xml:space="preserve">around  </w:t>
-      </w:r>
-      <w:r>
-        <w:rPr>
-          <w:rFonts w:eastAsia="Calibri" w:cs="Calibri"/>
-        </w:rPr>
-        <w:t>100</w:t>
+        <w:t>csv</w:t>
+      </w:r>
+      <w:proofErr w:type="spellEnd"/>
+      <w:r>
+        <w:rPr>
+          <w:rFonts w:eastAsia="Calibri" w:cs="Calibri"/>
+        </w:rPr>
+        <w:t>(</w:t>
       </w:r>
       <w:proofErr w:type="gramEnd"/>
       <w:r>
         <w:rPr>
           <w:rFonts w:eastAsia="Calibri" w:cs="Calibri"/>
         </w:rPr>
-        <w:t xml:space="preserve"> words)</w:t>
+        <w:t>) function. The dataset</w:t>
+      </w:r>
+      <w:r>
+        <w:rPr>
+          <w:rFonts w:eastAsia="Calibri" w:cs="Calibri"/>
+        </w:rPr>
+        <w:t xml:space="preserve"> </w:t>
+      </w:r>
+      <w:r>
+        <w:rPr>
+          <w:rFonts w:eastAsia="Calibri" w:cs="Calibri"/>
+        </w:rPr>
+        <w:t xml:space="preserve">structure was evaluated using </w:t>
+      </w:r>
+      <w:proofErr w:type="spellStart"/>
+      <w:proofErr w:type="gramStart"/>
+      <w:r>
+        <w:rPr>
+          <w:rFonts w:eastAsia="Calibri" w:cs="Calibri"/>
+        </w:rPr>
+        <w:t>df.shape</w:t>
+      </w:r>
+      <w:proofErr w:type="spellEnd"/>
+      <w:proofErr w:type="gramEnd"/>
+      <w:r>
+        <w:rPr>
+          <w:rFonts w:eastAsia="Calibri" w:cs="Calibri"/>
+        </w:rPr>
+        <w:t xml:space="preserve">, </w:t>
+      </w:r>
+      <w:proofErr w:type="gramStart"/>
+      <w:r>
+        <w:rPr>
+          <w:rFonts w:eastAsia="Calibri" w:cs="Calibri"/>
+        </w:rPr>
+        <w:t>df.info(</w:t>
+      </w:r>
+      <w:proofErr w:type="gramEnd"/>
+      <w:r>
+        <w:rPr>
+          <w:rFonts w:eastAsia="Calibri" w:cs="Calibri"/>
+        </w:rPr>
+        <w:t xml:space="preserve">), and </w:t>
+      </w:r>
+      <w:proofErr w:type="spellStart"/>
+      <w:proofErr w:type="gramStart"/>
+      <w:r>
+        <w:rPr>
+          <w:rFonts w:eastAsia="Calibri" w:cs="Calibri"/>
+        </w:rPr>
+        <w:t>df.describe</w:t>
+      </w:r>
+      <w:proofErr w:type="spellEnd"/>
+      <w:proofErr w:type="gramEnd"/>
+      <w:r>
+        <w:rPr>
+          <w:rFonts w:eastAsia="Calibri" w:cs="Calibri"/>
+        </w:rPr>
+        <w:t>(), which provided</w:t>
+      </w:r>
+      <w:r>
+        <w:rPr>
+          <w:rFonts w:eastAsia="Calibri" w:cs="Calibri"/>
+        </w:rPr>
+        <w:t xml:space="preserve"> </w:t>
+      </w:r>
+      <w:r>
+        <w:rPr>
+          <w:rFonts w:eastAsia="Calibri" w:cs="Calibri"/>
+        </w:rPr>
+        <w:t>information about the record count, data types, and summary statistics.</w:t>
+      </w:r>
+      <w:r>
+        <w:rPr>
+          <w:rFonts w:eastAsia="Calibri" w:cs="Calibri"/>
+        </w:rPr>
+        <w:t xml:space="preserve"> </w:t>
+      </w:r>
+      <w:r>
+        <w:rPr>
+          <w:rFonts w:eastAsia="Calibri" w:cs="Calibri"/>
+        </w:rPr>
+        <w:t xml:space="preserve">The dataset </w:t>
+      </w:r>
+      <w:proofErr w:type="spellStart"/>
+      <w:r>
+        <w:rPr>
+          <w:rFonts w:eastAsia="Calibri" w:cs="Calibri"/>
+        </w:rPr>
+        <w:t>analyzed</w:t>
+      </w:r>
+      <w:proofErr w:type="spellEnd"/>
+      <w:r>
+        <w:rPr>
+          <w:rFonts w:eastAsia="Calibri" w:cs="Calibri"/>
+        </w:rPr>
+        <w:t xml:space="preserve"> all missing information through </w:t>
+      </w:r>
+      <w:proofErr w:type="spellStart"/>
+      <w:r>
+        <w:rPr>
+          <w:rFonts w:eastAsia="Calibri" w:cs="Calibri"/>
+        </w:rPr>
+        <w:t>isnull</w:t>
+      </w:r>
+      <w:proofErr w:type="spellEnd"/>
+      <w:r>
+        <w:rPr>
+          <w:rFonts w:eastAsia="Calibri" w:cs="Calibri"/>
+        </w:rPr>
+        <w:t>(</w:t>
+      </w:r>
+      <w:proofErr w:type="gramStart"/>
+      <w:r>
+        <w:rPr>
+          <w:rFonts w:eastAsia="Calibri" w:cs="Calibri"/>
+        </w:rPr>
+        <w:t>).sum</w:t>
+      </w:r>
+      <w:proofErr w:type="gramEnd"/>
+      <w:r>
+        <w:rPr>
+          <w:rFonts w:eastAsia="Calibri" w:cs="Calibri"/>
+        </w:rPr>
+        <w:t>() which was used to find</w:t>
+      </w:r>
+      <w:r>
+        <w:rPr>
+          <w:rFonts w:eastAsia="Calibri" w:cs="Calibri"/>
+        </w:rPr>
+        <w:t xml:space="preserve"> </w:t>
+      </w:r>
+      <w:r>
+        <w:rPr>
+          <w:rFonts w:eastAsia="Calibri" w:cs="Calibri"/>
+        </w:rPr>
+        <w:t>all incomplete records. The dataset underwent duplicate testing through duplicated(</w:t>
+      </w:r>
+      <w:proofErr w:type="gramStart"/>
+      <w:r>
+        <w:rPr>
+          <w:rFonts w:eastAsia="Calibri" w:cs="Calibri"/>
+        </w:rPr>
+        <w:t>).sum</w:t>
+      </w:r>
+      <w:proofErr w:type="gramEnd"/>
+      <w:r>
+        <w:rPr>
+          <w:rFonts w:eastAsia="Calibri" w:cs="Calibri"/>
+        </w:rPr>
+        <w:t>() to</w:t>
+      </w:r>
+      <w:r>
+        <w:rPr>
+          <w:rFonts w:eastAsia="Calibri" w:cs="Calibri"/>
+        </w:rPr>
+        <w:t xml:space="preserve"> </w:t>
+      </w:r>
+      <w:r>
+        <w:rPr>
+          <w:rFonts w:eastAsia="Calibri" w:cs="Calibri"/>
+        </w:rPr>
+        <w:t>ensure that no repeated records existed, which would compromise the analysis.</w:t>
+      </w:r>
+      <w:r>
+        <w:rPr>
+          <w:rFonts w:eastAsia="Calibri" w:cs="Calibri"/>
+        </w:rPr>
+        <w:t xml:space="preserve"> </w:t>
+      </w:r>
+      <w:r>
+        <w:rPr>
+          <w:rFonts w:eastAsia="Calibri" w:cs="Calibri"/>
+        </w:rPr>
+        <w:t>The existing format of the dataset enabled researchers to perform exploratory analysis and</w:t>
+      </w:r>
+      <w:r>
+        <w:rPr>
+          <w:rFonts w:eastAsia="Calibri" w:cs="Calibri"/>
+        </w:rPr>
+        <w:t xml:space="preserve"> </w:t>
+      </w:r>
+      <w:r>
+        <w:rPr>
+          <w:rFonts w:eastAsia="Calibri" w:cs="Calibri"/>
+        </w:rPr>
+        <w:t>visualisation work without needing any structural changes to the dataset.</w:t>
       </w:r>
     </w:p>
     <w:p>

</xml_diff>

<commit_message>
Add Marek Tableau Techniques and Features
Add mine Techniques and features
</commit_message>
<xml_diff>
--- a/Data Visualisation and Insight Word File.docx
+++ b/Data Visualisation and Insight Word File.docx
@@ -64,6 +64,64 @@
     </w:p>
     <w:p>
       <w:pPr>
+        <w:jc w:val="center"/>
+        <w:rPr>
+          <w:b/>
+          <w:bCs/>
+        </w:rPr>
+      </w:pPr>
+      <w:r>
+        <w:rPr>
+          <w:b/>
+          <w:bCs/>
+        </w:rPr>
+        <w:t xml:space="preserve">| </w:t>
+      </w:r>
+      <w:r>
+        <w:rPr>
+          <w:b/>
+          <w:bCs/>
+        </w:rPr>
+        <w:t>T</w:t>
+      </w:r>
+      <w:r>
+        <w:rPr>
+          <w:b/>
+          <w:bCs/>
+        </w:rPr>
+        <w:t xml:space="preserve">ableau: </w:t>
+      </w:r>
+      <w:r>
+        <w:t xml:space="preserve">Marek </w:t>
+      </w:r>
+      <w:r>
+        <w:rPr>
+          <w:b/>
+          <w:bCs/>
+          <w:lang w:val="en-US"/>
+        </w:rPr>
+        <w:t>|</w:t>
+      </w:r>
+      <w:r>
+        <w:rPr>
+          <w:b/>
+          <w:bCs/>
+        </w:rPr>
+        <w:t xml:space="preserve"> Power BI: </w:t>
+      </w:r>
+      <w:r>
+        <w:t>Santhosh</w:t>
+      </w:r>
+      <w:r>
+        <w:rPr>
+          <w:b/>
+          <w:bCs/>
+        </w:rPr>
+        <w:t xml:space="preserve"> |</w:t>
+      </w:r>
+    </w:p>
+    <w:p>
+      <w:pPr>
         <w:pStyle w:val="Heading1"/>
       </w:pPr>
       <w:r>
@@ -188,11 +246,11 @@
         </w:rPr>
       </w:pPr>
       <w:r>
-        <w:t xml:space="preserve">The Global Road Accidents Dataset from Kaggle serves as the dataset for this research work. The dataset includes information about road traffic accidents together with multiple factors which may affect the probability of accidents and the severity of those </w:t>
+        <w:t xml:space="preserve">The Global Road Accidents Dataset from Kaggle serves as the dataset for this research work. The dataset includes information about road traffic accidents together with </w:t>
       </w:r>
       <w:r>
         <w:lastRenderedPageBreak/>
-        <w:t>accidents. It provides details about the conditions which existed during accidents together with the environmental elements and driver attributes.</w:t>
+        <w:t>multiple factors which may affect the probability of accidents and the severity of those accidents. It provides details about the conditions which existed during accidents together with the environmental elements and driver attributes.</w:t>
       </w:r>
       <w:r>
         <w:rPr>
@@ -656,6 +714,237 @@
       <w:r>
         <w:t>Techniques and Features</w:t>
       </w:r>
+    </w:p>
+    <w:p>
+      <w:r>
+        <w:t xml:space="preserve">Two dashboards meant to be created be tools such </w:t>
+      </w:r>
+      <w:proofErr w:type="spellStart"/>
+      <w:r>
+        <w:t>a</w:t>
+      </w:r>
+      <w:proofErr w:type="spellEnd"/>
+      <w:r>
+        <w:t xml:space="preserve"> </w:t>
+      </w:r>
+      <w:proofErr w:type="spellStart"/>
+      <w:r>
+        <w:t>PowerBI</w:t>
+      </w:r>
+      <w:proofErr w:type="spellEnd"/>
+      <w:r>
+        <w:t xml:space="preserve"> and Tableau.</w:t>
+      </w:r>
+      <w:r>
+        <w:t xml:space="preserve"> Themes</w:t>
+      </w:r>
+      <w:r>
+        <w:t xml:space="preserve">/topics </w:t>
+      </w:r>
+      <w:r>
+        <w:t>were split across two members of the group. Each dashboard should show intractability, visualisation and well-designed layout.</w:t>
+      </w:r>
+    </w:p>
+    <w:p>
+      <w:pPr>
+        <w:rPr>
+          <w:b/>
+          <w:bCs/>
+        </w:rPr>
+      </w:pPr>
+      <w:r>
+        <w:rPr>
+          <w:b/>
+          <w:bCs/>
+        </w:rPr>
+        <w:t xml:space="preserve">Tableau: </w:t>
+      </w:r>
+    </w:p>
+    <w:p>
+      <w:r>
+        <w:tab/>
+      </w:r>
+      <w:r>
+        <w:rPr>
+          <w:i/>
+          <w:iCs/>
+        </w:rPr>
+        <w:t xml:space="preserve">Line </w:t>
+      </w:r>
+      <w:r>
+        <w:rPr>
+          <w:i/>
+          <w:iCs/>
+        </w:rPr>
+        <w:t>chart</w:t>
+      </w:r>
+      <w:r>
+        <w:t xml:space="preserve">: </w:t>
+      </w:r>
+      <w:r>
+        <w:t>This graph illustrates the impact of speed limits. It shows the effect of speeds ranging from 30 km/h to 120 km/h. It allows you to visualize the consequences of high speeds.</w:t>
+      </w:r>
+    </w:p>
+    <w:p>
+      <w:r>
+        <w:tab/>
+      </w:r>
+      <w:r>
+        <w:rPr>
+          <w:i/>
+          <w:iCs/>
+        </w:rPr>
+        <w:t>Heatmap</w:t>
+      </w:r>
+      <w:r>
+        <w:t xml:space="preserve">: Likely the most complex graph. It </w:t>
+      </w:r>
+      <w:proofErr w:type="gramStart"/>
+      <w:r>
+        <w:t>visualize</w:t>
+      </w:r>
+      <w:proofErr w:type="gramEnd"/>
+      <w:r>
+        <w:t xml:space="preserve"> </w:t>
+      </w:r>
+      <w:r>
+        <w:t xml:space="preserve">the Accident Cause, Accident Severity </w:t>
+      </w:r>
+      <w:r>
+        <w:t xml:space="preserve">and </w:t>
+      </w:r>
+      <w:r>
+        <w:t>select specific measure (</w:t>
+      </w:r>
+      <w:proofErr w:type="spellStart"/>
+      <w:r>
+        <w:t>Cyclicts</w:t>
+      </w:r>
+      <w:proofErr w:type="spellEnd"/>
+      <w:r>
+        <w:t xml:space="preserve"> Involved</w:t>
+      </w:r>
+      <w:r>
+        <w:t xml:space="preserve">, </w:t>
+      </w:r>
+      <w:r>
+        <w:t>Driver Alcohol level</w:t>
+      </w:r>
+      <w:r>
+        <w:t xml:space="preserve">, </w:t>
+      </w:r>
+      <w:r>
+        <w:t>Driver Fatigue</w:t>
+      </w:r>
+      <w:r>
+        <w:t xml:space="preserve">, </w:t>
+      </w:r>
+      <w:r>
+        <w:t>Visibility Level</w:t>
+      </w:r>
+      <w:r>
+        <w:t xml:space="preserve">) to see the impact and the differences. </w:t>
+      </w:r>
+    </w:p>
+    <w:p>
+      <w:r>
+        <w:lastRenderedPageBreak/>
+        <w:tab/>
+      </w:r>
+      <w:r>
+        <w:rPr>
+          <w:i/>
+          <w:iCs/>
+        </w:rPr>
+        <w:t>Tree map</w:t>
+      </w:r>
+      <w:r>
+        <w:t>:</w:t>
+      </w:r>
+      <w:r>
+        <w:t xml:space="preserve"> </w:t>
+      </w:r>
+      <w:r>
+        <w:t>It is used as a visually appealing pie chart.</w:t>
+      </w:r>
+      <w:r>
+        <w:t xml:space="preserve"> Shows the consequences of driving on specific type of road. </w:t>
+      </w:r>
+    </w:p>
+    <w:p>
+      <w:pPr>
+        <w:rPr>
+          <w:i/>
+          <w:iCs/>
+        </w:rPr>
+      </w:pPr>
+      <w:r>
+        <w:tab/>
+      </w:r>
+      <w:r>
+        <w:rPr>
+          <w:i/>
+          <w:iCs/>
+        </w:rPr>
+        <w:t>Bar chart</w:t>
+      </w:r>
+      <w:r>
+        <w:t xml:space="preserve">: </w:t>
+      </w:r>
+      <w:r>
+        <w:t>A graph that tells us the story of the influence of population density on</w:t>
+      </w:r>
+      <w:r>
+        <w:t xml:space="preserve"> accident</w:t>
+      </w:r>
+      <w:r>
+        <w:t xml:space="preserve"> severity.</w:t>
+      </w:r>
+      <w:r>
+        <w:t xml:space="preserve"> </w:t>
+      </w:r>
+      <w:r>
+        <w:t>It should show us how population density changes based on accidents that occur in the surrounding area.</w:t>
+      </w:r>
+    </w:p>
+    <w:p>
+      <w:pPr>
+        <w:rPr>
+          <w:b/>
+          <w:bCs/>
+        </w:rPr>
+      </w:pPr>
+      <w:r>
+        <w:rPr>
+          <w:b/>
+          <w:bCs/>
+        </w:rPr>
+        <w:t>Power BI:</w:t>
+      </w:r>
+    </w:p>
+    <w:p>
+      <w:pPr>
+        <w:rPr>
+          <w:b/>
+          <w:bCs/>
+        </w:rPr>
+      </w:pPr>
+    </w:p>
+    <w:p>
+      <w:pPr>
+        <w:pStyle w:val="Heading1"/>
+      </w:pPr>
+      <w:r>
+        <w:t>Appraisal (Individual)</w:t>
+      </w:r>
+    </w:p>
+    <w:p>
+      <w:pPr>
+        <w:rPr>
+          <w:b/>
+          <w:bCs/>
+        </w:rPr>
+      </w:pPr>
     </w:p>
     <w:p/>
     <w:sectPr>

</xml_diff>